<commit_message>
Fix PSB experience: TPM duties only, no management reporting claim
</commit_message>
<xml_diff>
--- a/Abramov_DN_resume_PO_monitoring.docx
+++ b/Abramov_DN_resume_PO_monitoring.docx
@@ -356,11 +356,10 @@
         <w:rPr>
           <w:rFonts w:ascii="Arial" w:hAnsi="Arial" w:eastAsia="Arial"/>
           <w:b/>
-          <w:i w:val="0"/>
           <w:color w:val="222222"/>
           <w:sz w:val="21"/>
         </w:rPr>
-        <w:t>Эксперт по продукту управленческой отчётности и мониторингу контуров данных</w:t>
+        <w:t>Технический руководитель проекта (greenfield DWH)</w:t>
       </w:r>
     </w:p>
     <w:p>
@@ -387,11 +386,10 @@
         <w:rPr>
           <w:rFonts w:ascii="Arial" w:hAnsi="Arial" w:eastAsia="Arial"/>
           <w:b w:val="0"/>
-          <w:i w:val="0"/>
           <w:color w:val="222222"/>
           <w:sz w:val="20"/>
         </w:rPr>
-        <w:t>Развитие системы управленческой отчётности на greenfield DWH: методология показателей, логика витрин, критерии качества данных.</w:t>
+        <w:t>Организовано создание greenfield DWH на open-source стеке: архитектура и инфраструктура хранилища, разработка витрин, подключение BI-системы.</w:t>
       </w:r>
     </w:p>
     <w:p>
@@ -403,11 +401,10 @@
         <w:rPr>
           <w:rFonts w:ascii="Arial" w:hAnsi="Arial" w:eastAsia="Arial"/>
           <w:b w:val="0"/>
-          <w:i w:val="0"/>
           <w:color w:val="222222"/>
           <w:sz w:val="20"/>
         </w:rPr>
-        <w:t>Проработан контур поставки данных (источники → загрузка → витрины): сроки, зависимости, критерии готовности для потребителей отчётности и BI.</w:t>
+        <w:t>Выстроено взаимодействие с архитектурой и ИБ: согласование ключевых решений и документов по контурам данных и безопасности.</w:t>
       </w:r>
     </w:p>
     <w:p>
@@ -419,11 +416,10 @@
         <w:rPr>
           <w:rFonts w:ascii="Arial" w:hAnsi="Arial" w:eastAsia="Arial"/>
           <w:b w:val="0"/>
-          <w:i w:val="0"/>
           <w:color w:val="222222"/>
           <w:sz w:val="20"/>
         </w:rPr>
-        <w:t>Сформированы требования и критерии приёмки для команд DWH / ETL / BI; сценарии план–факт и анализ отклонений.</w:t>
+        <w:t>Сформирована и развивается кросс-функциональная команда проекта (бизнес- и ИТ-контур, подрядчики); организован подбор и распределение ресурсов.</w:t>
       </w:r>
     </w:p>
     <w:p>
@@ -435,11 +431,10 @@
         <w:rPr>
           <w:rFonts w:ascii="Arial" w:hAnsi="Arial" w:eastAsia="Arial"/>
           <w:b w:val="0"/>
-          <w:i w:val="0"/>
           <w:color w:val="222222"/>
           <w:sz w:val="20"/>
         </w:rPr>
-        <w:t>Спроектирована структура дашбордов и аналитических срезов для руководства; подготовлены материалы для стейкхолдеров.</w:t>
+        <w:t>Обеспечен контроль бюджета, рисков, скоупа и ресурсов; защита проекта и статуса перед бизнесом.</w:t>
       </w:r>
     </w:p>
     <w:p>
@@ -451,11 +446,10 @@
         <w:rPr>
           <w:rFonts w:ascii="Arial" w:hAnsi="Arial" w:eastAsia="Arial"/>
           <w:b w:val="0"/>
-          <w:i w:val="0"/>
           <w:color w:val="222222"/>
           <w:sz w:val="20"/>
         </w:rPr>
-        <w:t>Выстроен сквозной контур «источник → витрина → показатель → дашборд / отчётность» — основа для продукта мониторинга процессов загрузки и качества данных.</w:t>
+        <w:t>Согласованы ключевые документы проекта (цели, задачи, RoadMap, WBS, концептуальный дизайн, БТ, ТЗ) с ИТ, ИБ и бизнес-подразделениями; совместно со Scrum-мастером внедрены Agile-процессы на уровне проекта.</w:t>
       </w:r>
     </w:p>
     <w:p>
@@ -482,11 +476,10 @@
         <w:rPr>
           <w:rFonts w:ascii="Arial" w:hAnsi="Arial" w:eastAsia="Arial"/>
           <w:b w:val="0"/>
-          <w:i w:val="0"/>
           <w:color w:val="222222"/>
           <w:sz w:val="20"/>
         </w:rPr>
-        <w:t>Владение продуктовым контуром управленческой отчётности: потребности заказчиков, метрики, приоритизация, постановка и приёмка.</w:t>
+        <w:t>Техническое руководство проектом создания DWH: архитектура, инфраструктура, витрины, подключение BI.</w:t>
       </w:r>
     </w:p>
     <w:p>
@@ -498,11 +491,10 @@
         <w:rPr>
           <w:rFonts w:ascii="Arial" w:hAnsi="Arial" w:eastAsia="Arial"/>
           <w:b w:val="0"/>
-          <w:i w:val="0"/>
           <w:color w:val="222222"/>
           <w:sz w:val="20"/>
         </w:rPr>
-        <w:t>Проработка процессов и контуров данных совместно с бизнесом, ИТ, архитектурой и ИБ.</w:t>
+        <w:t>Финансы и бюджет проекта; планирование и контроль ресурсов.</w:t>
       </w:r>
     </w:p>
     <w:p>
@@ -514,11 +506,10 @@
         <w:rPr>
           <w:rFonts w:ascii="Arial" w:hAnsi="Arial" w:eastAsia="Arial"/>
           <w:b w:val="0"/>
-          <w:i w:val="0"/>
           <w:color w:val="222222"/>
           <w:sz w:val="20"/>
         </w:rPr>
-        <w:t>Описание процессов и подходов в объёме, необходимом для метрик и мониторинга (в т.ч. с элементами BPMN).</w:t>
+        <w:t>Подбор команды и взаимодействие с подрядчиками в процессе разработки.</w:t>
       </w:r>
     </w:p>
     <w:p>
@@ -530,11 +521,10 @@
         <w:rPr>
           <w:rFonts w:ascii="Arial" w:hAnsi="Arial" w:eastAsia="Arial"/>
           <w:b w:val="0"/>
-          <w:i w:val="0"/>
           <w:color w:val="222222"/>
           <w:sz w:val="20"/>
         </w:rPr>
-        <w:t>Взаимодействие с командами внедрения DWH / BI; формирование бэклога и дорожной карты аналитических сервисов.</w:t>
+        <w:t>Архитектурные решения и согласования с подразделениями архитектуры и информационной безопасности.</w:t>
       </w:r>
     </w:p>
     <w:p>
@@ -546,11 +536,10 @@
         <w:rPr>
           <w:rFonts w:ascii="Arial" w:hAnsi="Arial" w:eastAsia="Arial"/>
           <w:b w:val="0"/>
-          <w:i w:val="0"/>
           <w:color w:val="222222"/>
           <w:sz w:val="20"/>
         </w:rPr>
-        <w:t>Защита продуктового видения и результатов перед бизнесом.</w:t>
+        <w:t>Контроль скоупа, рисков и сроков; защита проекта перед бизнесом; ведение ключевых проектных документов и статусов.</w:t>
       </w:r>
     </w:p>
     <w:p>
@@ -3089,11 +3078,10 @@
         <w:rPr>
           <w:rFonts w:ascii="Arial" w:hAnsi="Arial" w:eastAsia="Arial"/>
           <w:b w:val="0"/>
-          <w:i w:val="0"/>
           <w:color w:val="222222"/>
           <w:sz w:val="21"/>
         </w:rPr>
-        <w:t>Развиваюсь как владелец продукта в зоне BI и мониторинга процессов данных: потребность → метрики и подход → дашборд на экране → обратная связь и следующий инкремент. Опыт CSI, End-to-End мониторинга процессов, систем мониторинга и управленческой отчётности в Сбере, телекоме и банках.</w:t>
+        <w:t>Развиваюсь как владелец продукта в зоне BI и мониторинга процессов данных: потребность → метрики и подход → дашборд на экране → обратная связь и следующий инкремент. Опыт CSI, End-to-End мониторинга процессов и систем мониторинга в Сбере и телекоме; в текущем банке — техническое руководство greenfield DWH (архитектура, ИБ, ресурсы, команда, бюджет).</w:t>
       </w:r>
     </w:p>
     <w:p>

</xml_diff>

<commit_message>
Frame PSB as deeper immersion from BI reporting into real DWH build
</commit_message>
<xml_diff>
--- a/Abramov_DN_resume_PO_monitoring.docx
+++ b/Abramov_DN_resume_PO_monitoring.docx
@@ -359,7 +359,7 @@
           <w:color w:val="222222"/>
           <w:sz w:val="21"/>
         </w:rPr>
-        <w:t>Технический руководитель проекта (greenfield DWH)</w:t>
+        <w:t>Технический руководитель проекта greenfield DWH (расширение экспертизы от BI к платформе данных)</w:t>
       </w:r>
     </w:p>
     <w:p>
@@ -389,7 +389,7 @@
           <w:color w:val="222222"/>
           <w:sz w:val="20"/>
         </w:rPr>
-        <w:t>Организовано создание greenfield DWH на open-source стеке: архитектура и инфраструктура хранилища, разработка витрин, подключение BI-системы.</w:t>
+        <w:t>Расширение погружения после BI / управленческой отчётности (Axenix): переход на смежный уровень — реальное построение хранилища данных, а не только потребление витрин. Организовано создание greenfield DWH на open-source стеке: архитектура и инфраструктура, витрины, подключение BI.</w:t>
       </w:r>
     </w:p>
     <w:p>
@@ -404,7 +404,7 @@
           <w:color w:val="222222"/>
           <w:sz w:val="20"/>
         </w:rPr>
-        <w:t>Выстроено взаимодействие с архитектурой и ИБ: согласование ключевых решений и документов по контурам данных и безопасности.</w:t>
+        <w:t>На практике выстроены контуры данных и согласований с архитектурой и ИБ — от решений по хранению и загрузке до допуска в промышленный контур.</w:t>
       </w:r>
     </w:p>
     <w:p>
@@ -419,7 +419,7 @@
           <w:color w:val="222222"/>
           <w:sz w:val="20"/>
         </w:rPr>
-        <w:t>Сформирована и развивается кросс-функциональная команда проекта (бизнес- и ИТ-контур, подрядчики); организован подбор и распределение ресурсов.</w:t>
+        <w:t>Собрана и развивается кросс-функциональная команда (бизнес, ИТ, подрядчики): подбор людей, распределение ресурсов, управление загрузкой команд на реальном строительстве платформы.</w:t>
       </w:r>
     </w:p>
     <w:p>
@@ -434,7 +434,7 @@
           <w:color w:val="222222"/>
           <w:sz w:val="20"/>
         </w:rPr>
-        <w:t>Обеспечен контроль бюджета, рисков, скоупа и ресурсов; защита проекта и статуса перед бизнесом.</w:t>
+        <w:t>Ведение финансов и закупок проекта, контроль бюджета, рисков и скоупа; защита статуса и решений перед бизнесом.</w:t>
       </w:r>
     </w:p>
     <w:p>
@@ -449,7 +449,7 @@
           <w:color w:val="222222"/>
           <w:sz w:val="20"/>
         </w:rPr>
-        <w:t>Согласованы ключевые документы проекта (цели, задачи, RoadMap, WBS, концептуальный дизайн, БТ, ТЗ) с ИТ, ИБ и бизнес-подразделениями; совместно со Scrum-мастером внедрены Agile-процессы на уровне проекта.</w:t>
+        <w:t>Согласованы ключевые документы (цели, RoadMap, концептуальный дизайн, БТ, ТЗ) с ИТ, ИБ и бизнесом; совместно со Scrum-мастером внедрены Agile-процессы — полный цикл реального построения контуров DWH.</w:t>
       </w:r>
     </w:p>
     <w:p>
@@ -479,7 +479,7 @@
           <w:color w:val="222222"/>
           <w:sz w:val="20"/>
         </w:rPr>
-        <w:t>Техническое руководство проектом создания DWH: архитектура, инфраструктура, витрины, подключение BI.</w:t>
+        <w:t>Техническое руководство проектом создания DWH: архитектура, инфраструктура, витрины, подключение BI — как следующий уровень после построения систем управленческой отчётности.</w:t>
       </w:r>
     </w:p>
     <w:p>
@@ -494,7 +494,7 @@
           <w:color w:val="222222"/>
           <w:sz w:val="20"/>
         </w:rPr>
-        <w:t>Финансы и бюджет проекта; планирование и контроль ресурсов.</w:t>
+        <w:t>Финансы, бюджет и закупки проекта; планирование и контроль ресурсов.</w:t>
       </w:r>
     </w:p>
     <w:p>
@@ -509,7 +509,7 @@
           <w:color w:val="222222"/>
           <w:sz w:val="20"/>
         </w:rPr>
-        <w:t>Подбор команды и взаимодействие с подрядчиками в процессе разработки.</w:t>
+        <w:t>Подбор команды и взаимодействие с подрядчиками на всём цикле разработки.</w:t>
       </w:r>
     </w:p>
     <w:p>
@@ -524,7 +524,7 @@
           <w:color w:val="222222"/>
           <w:sz w:val="20"/>
         </w:rPr>
-        <w:t>Архитектурные решения и согласования с подразделениями архитектуры и информационной безопасности.</w:t>
+        <w:t>Архитектурные решения; глубокое взаимодействие с архитектурой и информационной безопасностью.</w:t>
       </w:r>
     </w:p>
     <w:p>
@@ -539,7 +539,7 @@
           <w:color w:val="222222"/>
           <w:sz w:val="20"/>
         </w:rPr>
-        <w:t>Контроль скоупа, рисков и сроков; защита проекта перед бизнесом; ведение ключевых проектных документов и статусов.</w:t>
+        <w:t>Контроль скоупа, рисков и сроков; защита проекта перед бизнесом; ведение RoadMap и ключевых проектных документов.</w:t>
       </w:r>
     </w:p>
     <w:p>
@@ -636,11 +636,10 @@
         <w:rPr>
           <w:rFonts w:ascii="Arial" w:hAnsi="Arial" w:eastAsia="Arial"/>
           <w:b w:val="0"/>
-          <w:i w:val="0"/>
           <w:color w:val="222222"/>
           <w:sz w:val="20"/>
         </w:rPr>
-        <w:t>Реализованы дашборды для топ-менеджмента крупнейшего металлургического комбината России (НЛМК) на платформе Форсайт — управленческая аналитика и визуализация KPI.</w:t>
+        <w:t>Построена система управленческой отчётности и BI для топ-менеджмента крупнейшего металлургического комбината России (НЛМК) на платформе Форсайт — дашборды, KPI, регулярная аналитика.</w:t>
       </w:r>
     </w:p>
     <w:p>
@@ -652,11 +651,10 @@
         <w:rPr>
           <w:rFonts w:ascii="Arial" w:hAnsi="Arial" w:eastAsia="Arial"/>
           <w:b w:val="0"/>
-          <w:i w:val="0"/>
           <w:color w:val="222222"/>
           <w:sz w:val="20"/>
         </w:rPr>
-        <w:t>Поставлены BI-продукты: от сбора потребностей и приоритизации до приёмки с бизнесом и обратной связи после внедрения.</w:t>
+        <w:t>С нуля / с развития контура выведены BI-продукты: потребности заказчика → метрики → дашборды → приёмка и обратная связь.</w:t>
       </w:r>
     </w:p>
     <w:p>
@@ -699,11 +697,10 @@
         <w:rPr>
           <w:rFonts w:ascii="Arial" w:hAnsi="Arial" w:eastAsia="Arial"/>
           <w:b w:val="0"/>
-          <w:i w:val="0"/>
           <w:color w:val="222222"/>
           <w:sz w:val="20"/>
         </w:rPr>
-        <w:t>Ведение BI-продуктов для клиентов: discovery, варианты реализации, проектирование отчётности, приёмка.</w:t>
+        <w:t>Построение систем управленческой отчётности и BI: discovery, варианты реализации, проектирование, постановка, приёмка.</w:t>
       </w:r>
     </w:p>
     <w:p>
@@ -3081,7 +3078,7 @@
           <w:color w:val="222222"/>
           <w:sz w:val="21"/>
         </w:rPr>
-        <w:t>Развиваюсь как владелец продукта в зоне BI и мониторинга процессов данных: потребность → метрики и подход → дашборд на экране → обратная связь и следующий инкремент. Опыт CSI, End-to-End мониторинга процессов и систем мониторинга в Сбере и телекоме; в текущем банке — техническое руководство greenfield DWH (архитектура, ИБ, ресурсы, команда, бюджет).</w:t>
+        <w:t>Развиваюсь как владелец продукта в зоне BI и мониторинга процессов данных: потребность → метрики и подход → дашборд на экране → обратная связь и следующий инкремент. В Axenix — построение систем управленческой отчётности и BI; в ПСБ — расширение погружения на смежный уровень: реальное создание greenfield DWH (контуры данных, архитектура, ИБ, команда, ресурсы, закупки). Опыт CSI и End-to-End мониторинга процессов в SberData; системы мониторинга в телекоме.</w:t>
       </w:r>
     </w:p>
     <w:p>

</xml_diff>

<commit_message>
Tone down PSB wording, fix DWH then BI order, add CI/CD
</commit_message>
<xml_diff>
--- a/Abramov_DN_resume_PO_monitoring.docx
+++ b/Abramov_DN_resume_PO_monitoring.docx
@@ -359,7 +359,7 @@
           <w:color w:val="222222"/>
           <w:sz w:val="21"/>
         </w:rPr>
-        <w:t>Технический руководитель проекта greenfield DWH (расширение экспертизы от BI к платформе данных)</w:t>
+        <w:t>Технический руководитель проекта (greenfield DWH)</w:t>
       </w:r>
     </w:p>
     <w:p>
@@ -389,7 +389,7 @@
           <w:color w:val="222222"/>
           <w:sz w:val="20"/>
         </w:rPr>
-        <w:t>Расширение погружения после BI / управленческой отчётности (Axenix): переход на смежный уровень — реальное построение хранилища данных, а не только потребление витрин. Организовано создание greenfield DWH на open-source стеке: архитектура и инфраструктура, витрины, подключение BI.</w:t>
+        <w:t>После опыта построения систем управленческой отчётности и BI (Axenix) — расширение компетенции на уровень платформы данных. Создание greenfield DWH на open-source стеке: архитектура, инфраструктура, контуры загрузки, витрины; затем подключение BI. Выстроен CI/CD для поставки изменений по контурам хранилища.</w:t>
       </w:r>
     </w:p>
     <w:p>
@@ -404,7 +404,7 @@
           <w:color w:val="222222"/>
           <w:sz w:val="20"/>
         </w:rPr>
-        <w:t>На практике выстроены контуры данных и согласований с архитектурой и ИБ — от решений по хранению и загрузке до допуска в промышленный контур.</w:t>
+        <w:t>Выстроены контуры данных и процессы согласования с архитектурой и ИБ: хранение, загрузка, промышленный контур.</w:t>
       </w:r>
     </w:p>
     <w:p>
@@ -419,7 +419,7 @@
           <w:color w:val="222222"/>
           <w:sz w:val="20"/>
         </w:rPr>
-        <w:t>Собрана и развивается кросс-функциональная команда (бизнес, ИТ, подрядчики): подбор людей, распределение ресурсов, управление загрузкой команд на реальном строительстве платформы.</w:t>
+        <w:t>Собрана и развивается кросс-функциональная команда (бизнес, ИТ, подрядчики): подбор, распределение ресурсов, координация работ.</w:t>
       </w:r>
     </w:p>
     <w:p>
@@ -434,7 +434,7 @@
           <w:color w:val="222222"/>
           <w:sz w:val="20"/>
         </w:rPr>
-        <w:t>Ведение финансов и закупок проекта, контроль бюджета, рисков и скоупа; защита статуса и решений перед бизнесом.</w:t>
+        <w:t>Финансы и закупки проекта; контроль бюджета, рисков и скоупа; защита статуса перед бизнесом.</w:t>
       </w:r>
     </w:p>
     <w:p>
@@ -449,7 +449,7 @@
           <w:color w:val="222222"/>
           <w:sz w:val="20"/>
         </w:rPr>
-        <w:t>Согласованы ключевые документы (цели, RoadMap, концептуальный дизайн, БТ, ТЗ) с ИТ, ИБ и бизнесом; совместно со Scrum-мастером внедрены Agile-процессы — полный цикл реального построения контуров DWH.</w:t>
+        <w:t>Согласованы ключевые документы (цели, RoadMap, концептуальный дизайн, БТ, ТЗ) с ИТ, ИБ и бизнесом; совместно со Scrum-мастером внедрены Agile-процессы; организован CI/CD.</w:t>
       </w:r>
     </w:p>
     <w:p>
@@ -479,7 +479,7 @@
           <w:color w:val="222222"/>
           <w:sz w:val="20"/>
         </w:rPr>
-        <w:t>Техническое руководство проектом создания DWH: архитектура, инфраструктура, витрины, подключение BI — как следующий уровень после построения систем управленческой отчётности.</w:t>
+        <w:t>Техническое руководство проектом создания DWH: архитектура, инфраструктура, контуры загрузки, витрины; подключение BI после готовности контуров хранилища.</w:t>
       </w:r>
     </w:p>
     <w:p>
@@ -494,7 +494,7 @@
           <w:color w:val="222222"/>
           <w:sz w:val="20"/>
         </w:rPr>
-        <w:t>Финансы, бюджет и закупки проекта; планирование и контроль ресурсов.</w:t>
+        <w:t>Финансы, бюджет и закупки; планирование и контроль ресурсов.</w:t>
       </w:r>
     </w:p>
     <w:p>
@@ -509,7 +509,7 @@
           <w:color w:val="222222"/>
           <w:sz w:val="20"/>
         </w:rPr>
-        <w:t>Подбор команды и взаимодействие с подрядчиками на всём цикле разработки.</w:t>
+        <w:t>Подбор команды; взаимодействие с подрядчиками.</w:t>
       </w:r>
     </w:p>
     <w:p>
@@ -524,7 +524,7 @@
           <w:color w:val="222222"/>
           <w:sz w:val="20"/>
         </w:rPr>
-        <w:t>Архитектурные решения; глубокое взаимодействие с архитектурой и информационной безопасностью.</w:t>
+        <w:t>Архитектурные решения; взаимодействие с подразделениями архитектуры и информационной безопасности.</w:t>
       </w:r>
     </w:p>
     <w:p>
@@ -539,7 +539,7 @@
           <w:color w:val="222222"/>
           <w:sz w:val="20"/>
         </w:rPr>
-        <w:t>Контроль скоупа, рисков и сроков; защита проекта перед бизнесом; ведение RoadMap и ключевых проектных документов.</w:t>
+        <w:t>Контроль скоупа, рисков и сроков; защита проекта перед бизнесом; RoadMap и проектные документы; развитие CI/CD.</w:t>
       </w:r>
     </w:p>
     <w:p>
@@ -654,7 +654,7 @@
           <w:color w:val="222222"/>
           <w:sz w:val="20"/>
         </w:rPr>
-        <w:t>С нуля / с развития контура выведены BI-продукты: потребности заказчика → метрики → дашборды → приёмка и обратная связь.</w:t>
+        <w:t>Выведены BI-продукты: потребности заказчика → метрики → дашборды → приёмка и обратная связь.</w:t>
       </w:r>
     </w:p>
     <w:p>
@@ -3078,7 +3078,7 @@
           <w:color w:val="222222"/>
           <w:sz w:val="21"/>
         </w:rPr>
-        <w:t>Развиваюсь как владелец продукта в зоне BI и мониторинга процессов данных: потребность → метрики и подход → дашборд на экране → обратная связь и следующий инкремент. В Axenix — построение систем управленческой отчётности и BI; в ПСБ — расширение погружения на смежный уровень: реальное создание greenfield DWH (контуры данных, архитектура, ИБ, команда, ресурсы, закупки). Опыт CSI и End-to-End мониторинга процессов в SberData; системы мониторинга в телекоме.</w:t>
+        <w:t>Развиваюсь как владелец продукта в зоне BI и мониторинга процессов данных: потребность → метрики и подход → дашборд → обратная связь и следующий инкремент. В Axenix — системы управленческой отчётности и BI; в ПСБ — расширение компетенции на платформу данных: greenfield DWH, контуры загрузки, архитектура, ИБ, CI/CD, команда, ресурсы, закупки. Опыт CSI и End-to-End мониторинга процессов в SberData; системы мониторинга в телекоме.</w:t>
       </w:r>
     </w:p>
     <w:p>

</xml_diff>

<commit_message>
Add AI models for assessment and forecasting in Axenix BI
</commit_message>
<xml_diff>
--- a/Abramov_DN_resume_PO_monitoring.docx
+++ b/Abramov_DN_resume_PO_monitoring.docx
@@ -639,7 +639,7 @@
           <w:color w:val="222222"/>
           <w:sz w:val="20"/>
         </w:rPr>
-        <w:t>Построена система управленческой отчётности и BI для топ-менеджмента крупнейшего металлургического комбината России (НЛМК) на платформе Форсайт — дашборды, KPI, регулярная аналитика.</w:t>
+        <w:t>Построена система управленческой отчётности и BI для топ-менеджмента крупнейшего металлургического комбината России (НЛМК) на платформе Форсайт — дашборды, KPI, регулярная аналитика; в контуре дашбордов использованы модели ИИ для оценки и прогнозирования показателей.</w:t>
       </w:r>
     </w:p>
     <w:p>
@@ -654,7 +654,7 @@
           <w:color w:val="222222"/>
           <w:sz w:val="20"/>
         </w:rPr>
-        <w:t>Выведены BI-продукты: потребности заказчика → метрики → дашборды → приёмка и обратная связь.</w:t>
+        <w:t>Выведены BI-продукты: потребности заказчика → метрики → дашборды с применением моделей ИИ (оценка и прогноз) → приёмка и обратная связь.</w:t>
       </w:r>
     </w:p>
     <w:p>
@@ -700,7 +700,7 @@
           <w:color w:val="222222"/>
           <w:sz w:val="20"/>
         </w:rPr>
-        <w:t>Построение систем управленческой отчётности и BI: discovery, варианты реализации, проектирование, постановка, приёмка.</w:t>
+        <w:t>Построение систем управленческой отчётности и BI: discovery, проектирование дашбордов, интеграция моделей ИИ для оценки и прогноза, постановка, приёмка.</w:t>
       </w:r>
     </w:p>
     <w:p>
@@ -2979,11 +2979,10 @@
         <w:rPr>
           <w:rFonts w:ascii="Arial" w:hAnsi="Arial" w:eastAsia="Arial"/>
           <w:b w:val="0"/>
-          <w:i w:val="0"/>
           <w:color w:val="222222"/>
           <w:sz w:val="20"/>
         </w:rPr>
-        <w:t>Product ownership  ·  Мониторинг процессов  ·  BI  ·  Дашборды  ·  QlikView  ·  QlikSense  ·  Power BI  ·  Управленческая отчётность  ·  KPI / SLA  ·  Бизнес-анализ  ·  Discovery  ·  BPMN  ·  Постановка требований  ·  Приёмка  ·  DWH  ·  Качество данных  ·  CSI  ·  Анализ данных  ·  MS Excel  ·  Jira  ·  Confluence  ·  Agile  ·  SQL  ·  Проведение презентаций  ·  Работа с большим объёмом информации</w:t>
+        <w:t>Product ownership  ·  Мониторинг процессов  ·  BI  ·  Дашборды  ·  QlikView  ·  QlikSense  ·  Power BI  ·  Управленческая отчётность  ·  KPI / SLA  ·  Бизнес-анализ  ·  Discovery  ·  BPMN  ·  Постановка требований  ·  Приёмка  ·  DWH  ·  Качество данных  ·  CSI  ·  Модели ИИ (оценка и прогноз)  ·  Анализ данных  ·  MS Excel  ·  Jira  ·  Confluence  ·  Agile  ·  SQL  ·  Проведение презентаций  ·  Работа с большим объёмом информации</w:t>
       </w:r>
     </w:p>
     <w:p>

</xml_diff>

<commit_message>
Shorten Bell, Verisel, MTS experience to 5 key lines each
</commit_message>
<xml_diff>
--- a/Abramov_DN_resume_PO_monitoring.docx
+++ b/Abramov_DN_resume_PO_monitoring.docx
@@ -1323,36 +1323,94 @@
         <w:rPr>
           <w:rFonts w:ascii="Arial" w:hAnsi="Arial" w:eastAsia="Arial"/>
           <w:b/>
-          <w:i w:val="0"/>
           <w:color w:val="222222"/>
           <w:sz w:val="20"/>
         </w:rPr>
-        <w:t>Февраль 2010 — Декабрь 2011</w:t>
+        <w:t>Февраль 2010 — Декабрь 2011    1 год 11 месяцев</w:t>
       </w:r>
+    </w:p>
+    <w:p>
+      <w:pPr>
+        <w:spacing w:before="0" w:after="20" w:line="252" w:lineRule="auto"/>
+      </w:pPr>
+      <w:r>
+        <w:rPr>
+          <w:rFonts w:ascii="Arial" w:hAnsi="Arial" w:eastAsia="Arial"/>
+          <w:b/>
+          <w:color w:val="222222"/>
+          <w:sz w:val="21"/>
+        </w:rPr>
+        <w:t>ЗАО «Беллинтегратор» — Менеджер проектов BI и мониторинга</w:t>
+      </w:r>
+    </w:p>
+    <w:p>
+      <w:pPr>
+        <w:spacing w:before="0" w:after="0" w:line="252" w:lineRule="auto"/>
+      </w:pPr>
       <w:r>
         <w:rPr>
           <w:rFonts w:ascii="Arial" w:hAnsi="Arial" w:eastAsia="Arial"/>
           <w:b w:val="0"/>
-          <w:i w:val="0"/>
-          <w:color w:val="666666"/>
-          <w:sz w:val="19"/>
+          <w:color w:val="222222"/>
+          <w:sz w:val="20"/>
         </w:rPr>
-        <w:t xml:space="preserve">    1 год 11 месяцев</w:t>
+        <w:t>• 30+ проектов BI и систем мониторинга (МТС, ВымпелКом, МегаФон, банки, ЦППК).</w:t>
       </w:r>
     </w:p>
     <w:p>
       <w:pPr>
-        <w:spacing w:before="0" w:after="20" w:line="252" w:lineRule="auto"/>
+        <w:spacing w:before="0" w:after="0" w:line="252" w:lineRule="auto"/>
+      </w:pPr>
+      <w:r>
+        <w:rPr>
+          <w:rFonts w:ascii="Arial" w:hAnsi="Arial" w:eastAsia="Arial"/>
+          <w:b w:val="0"/>
+          <w:color w:val="222222"/>
+          <w:sz w:val="20"/>
+        </w:rPr>
+        <w:t>• Требования, БТ/ТЗ, источники данных, постановка и приёмка, обучение пользователей.</w:t>
+      </w:r>
+    </w:p>
+    <w:p>
+      <w:pPr>
+        <w:spacing w:before="0" w:after="0" w:line="252" w:lineRule="auto"/>
+      </w:pPr>
+      <w:r>
+        <w:rPr>
+          <w:rFonts w:ascii="Arial" w:hAnsi="Arial" w:eastAsia="Arial"/>
+          <w:b w:val="0"/>
+          <w:color w:val="222222"/>
+          <w:sz w:val="20"/>
+        </w:rPr>
+        <w:t>• Подбор решений BI / мониторинга под задачу заказчика.</w:t>
+      </w:r>
+    </w:p>
+    <w:p>
+      <w:pPr>
+        <w:spacing w:before="200" w:after="20"/>
       </w:pPr>
       <w:r>
         <w:rPr>
           <w:rFonts w:ascii="Arial" w:hAnsi="Arial" w:eastAsia="Arial"/>
           <w:b/>
-          <w:i w:val="0"/>
           <w:color w:val="222222"/>
-          <w:sz w:val="22"/>
+          <w:sz w:val="20"/>
         </w:rPr>
-        <w:t>ЗАО «Беллинтегратор»</w:t>
+        <w:t>Декабрь 2007 — Декабрь 2009    2 года 1 месяц</w:t>
+      </w:r>
+    </w:p>
+    <w:p>
+      <w:pPr>
+        <w:spacing w:before="0" w:after="20" w:line="252" w:lineRule="auto"/>
+      </w:pPr>
+      <w:r>
+        <w:rPr>
+          <w:rFonts w:ascii="Arial" w:hAnsi="Arial" w:eastAsia="Arial"/>
+          <w:b/>
+          <w:color w:val="222222"/>
+          <w:sz w:val="21"/>
+        </w:rPr>
+        <w:t>ЗАО «Верисел Проекты» — Менеджер проектов по системам мониторинга</w:t>
       </w:r>
     </w:p>
     <w:p>
@@ -1363,11 +1421,10 @@
         <w:rPr>
           <w:rFonts w:ascii="Arial" w:hAnsi="Arial" w:eastAsia="Arial"/>
           <w:b w:val="0"/>
-          <w:i w:val="0"/>
-          <w:color w:val="666666"/>
-          <w:sz w:val="19"/>
+          <w:color w:val="222222"/>
+          <w:sz w:val="20"/>
         </w:rPr>
-        <w:t>Москва, www.bellintegrator.ru</w:t>
+        <w:t>• Пилот мониторинга в ЦентрТелекоме; проекты МТС, ЦентрТелеком.</w:t>
       </w:r>
     </w:p>
     <w:p>
@@ -1378,11 +1435,10 @@
         <w:rPr>
           <w:rFonts w:ascii="Arial" w:hAnsi="Arial" w:eastAsia="Arial"/>
           <w:b w:val="0"/>
-          <w:i w:val="0"/>
-          <w:color w:val="666666"/>
-          <w:sz w:val="19"/>
+          <w:color w:val="222222"/>
+          <w:sz w:val="20"/>
         </w:rPr>
-        <w:t>Информационные технологии, системная интеграция, интернет</w:t>
+        <w:t>• Мониторинг бизнес-приложений в ИНГ Банк (Евразия).</w:t>
       </w:r>
     </w:p>
     <w:p>
@@ -1393,11 +1449,38 @@
         <w:rPr>
           <w:rFonts w:ascii="Arial" w:hAnsi="Arial" w:eastAsia="Arial"/>
           <w:b w:val="0"/>
-          <w:i w:val="0"/>
-          <w:color w:val="666666"/>
-          <w:sz w:val="19"/>
+          <w:color w:val="222222"/>
+          <w:sz w:val="20"/>
         </w:rPr>
-        <w:t>• Разработка программного обеспечения</w:t>
+        <w:t>• Проектная документация; координация субподрядчиков.</w:t>
+      </w:r>
+    </w:p>
+    <w:p>
+      <w:pPr>
+        <w:spacing w:before="200" w:after="20"/>
+      </w:pPr>
+      <w:r>
+        <w:rPr>
+          <w:rFonts w:ascii="Arial" w:hAnsi="Arial" w:eastAsia="Arial"/>
+          <w:b/>
+          <w:color w:val="222222"/>
+          <w:sz w:val="20"/>
+        </w:rPr>
+        <w:t>Январь 2007 — Декабрь 2007    1 год</w:t>
+      </w:r>
+    </w:p>
+    <w:p>
+      <w:pPr>
+        <w:spacing w:before="0" w:after="20" w:line="252" w:lineRule="auto"/>
+      </w:pPr>
+      <w:r>
+        <w:rPr>
+          <w:rFonts w:ascii="Arial" w:hAnsi="Arial" w:eastAsia="Arial"/>
+          <w:b/>
+          <w:color w:val="222222"/>
+          <w:sz w:val="21"/>
+        </w:rPr>
+        <w:t>МТС — Руководитель группы развития системы мониторинга (МТС Россия)</w:t>
       </w:r>
     </w:p>
     <w:p>
@@ -1408,636 +1491,38 @@
         <w:rPr>
           <w:rFonts w:ascii="Arial" w:hAnsi="Arial" w:eastAsia="Arial"/>
           <w:b w:val="0"/>
-          <w:i w:val="0"/>
-          <w:color w:val="666666"/>
-          <w:sz w:val="19"/>
+          <w:color w:val="222222"/>
+          <w:sz w:val="20"/>
         </w:rPr>
-        <w:t>• Системная интеграция, автоматизация технологических и бизнес-процессов, ИТ-консалтинг</w:t>
+        <w:t>• Архитектура и прототип Единой системы мониторинга: данные и визуализация бизнес-KPI.</w:t>
       </w:r>
     </w:p>
     <w:p>
       <w:pPr>
-        <w:spacing w:before="80" w:after="60" w:line="252" w:lineRule="auto"/>
-      </w:pPr>
-      <w:r>
-        <w:rPr>
-          <w:rFonts w:ascii="Arial" w:hAnsi="Arial" w:eastAsia="Arial"/>
-          <w:b/>
-          <w:i w:val="0"/>
-          <w:color w:val="222222"/>
-          <w:sz w:val="21"/>
-        </w:rPr>
-        <w:t>Менеджер проектов по системам BI и мониторинга</w:t>
-      </w:r>
-    </w:p>
-    <w:p>
-      <w:pPr>
-        <w:spacing w:before="80" w:after="40" w:line="252" w:lineRule="auto"/>
-      </w:pPr>
-      <w:r>
-        <w:rPr>
-          <w:rFonts w:ascii="Arial" w:hAnsi="Arial" w:eastAsia="Arial"/>
-          <w:b/>
-          <w:i w:val="0"/>
-          <w:color w:val="222222"/>
-          <w:sz w:val="20"/>
-        </w:rPr>
-        <w:t>Достижения:</w:t>
-      </w:r>
-    </w:p>
-    <w:p>
-      <w:pPr>
-        <w:pStyle w:val="ListBullet"/>
-        <w:spacing w:before="0" w:after="20" w:line="252" w:lineRule="auto"/>
+        <w:spacing w:before="0" w:after="0" w:line="252" w:lineRule="auto"/>
       </w:pPr>
       <w:r>
         <w:rPr>
           <w:rFonts w:ascii="Arial" w:hAnsi="Arial" w:eastAsia="Arial"/>
           <w:b w:val="0"/>
-          <w:i w:val="0"/>
           <w:color w:val="222222"/>
           <w:sz w:val="20"/>
         </w:rPr>
-        <w:t>Реализовано 30+ проектов по внедрению и доработке систем мониторинга и BI у крупных заказчиков: МТС, ВымпелКом, МегаФон, БСЖВ, КИТ Финанс, Центральная ППК.</w:t>
+        <w:t>• Регламенты и инструкции; защита бюджета на инвесткомитете.</w:t>
       </w:r>
     </w:p>
     <w:p>
       <w:pPr>
-        <w:spacing w:before="80" w:after="40" w:line="252" w:lineRule="auto"/>
-      </w:pPr>
-      <w:r>
-        <w:rPr>
-          <w:rFonts w:ascii="Arial" w:hAnsi="Arial" w:eastAsia="Arial"/>
-          <w:b/>
-          <w:i w:val="0"/>
-          <w:color w:val="222222"/>
-          <w:sz w:val="20"/>
-        </w:rPr>
-        <w:t>Обязанности:</w:t>
-      </w:r>
-    </w:p>
-    <w:p>
-      <w:pPr>
-        <w:pStyle w:val="ListBullet"/>
-        <w:spacing w:before="0" w:after="20" w:line="252" w:lineRule="auto"/>
+        <w:spacing w:before="0" w:after="0" w:line="252" w:lineRule="auto"/>
       </w:pPr>
       <w:r>
         <w:rPr>
           <w:rFonts w:ascii="Arial" w:hAnsi="Arial" w:eastAsia="Arial"/>
           <w:b w:val="0"/>
-          <w:i w:val="0"/>
           <w:color w:val="222222"/>
           <w:sz w:val="20"/>
         </w:rPr>
-        <w:t>Ведение проектов по BI и системам мониторинга: выявление требований, варианты реализации, постановка, приёмка.</w:t>
-      </w:r>
-    </w:p>
-    <w:p>
-      <w:pPr>
-        <w:pStyle w:val="ListBullet"/>
-        <w:spacing w:before="0" w:after="20" w:line="252" w:lineRule="auto"/>
-      </w:pPr>
-      <w:r>
-        <w:rPr>
-          <w:rFonts w:ascii="Arial" w:hAnsi="Arial" w:eastAsia="Arial"/>
-          <w:b w:val="0"/>
-          <w:i w:val="0"/>
-          <w:color w:val="222222"/>
-          <w:sz w:val="20"/>
-        </w:rPr>
-        <w:t>Подбор решений в области BI и мониторинга; обучение пользователей.</w:t>
-      </w:r>
-    </w:p>
-    <w:p>
-      <w:pPr>
-        <w:pStyle w:val="ListBullet"/>
-        <w:spacing w:before="0" w:after="20" w:line="252" w:lineRule="auto"/>
-      </w:pPr>
-      <w:r>
-        <w:rPr>
-          <w:rFonts w:ascii="Arial" w:hAnsi="Arial" w:eastAsia="Arial"/>
-          <w:b w:val="0"/>
-          <w:i w:val="0"/>
-          <w:color w:val="222222"/>
-          <w:sz w:val="20"/>
-        </w:rPr>
-        <w:t>Создание БТ, ДБТ, ТЗ; анализ структуры источников данных и способов подключения.</w:t>
-      </w:r>
-    </w:p>
-    <w:p>
-      <w:pPr>
-        <w:pStyle w:val="ListBullet"/>
-        <w:spacing w:before="0" w:after="20" w:line="252" w:lineRule="auto"/>
-      </w:pPr>
-      <w:r>
-        <w:rPr>
-          <w:rFonts w:ascii="Arial" w:hAnsi="Arial" w:eastAsia="Arial"/>
-          <w:b w:val="0"/>
-          <w:i w:val="0"/>
-          <w:color w:val="222222"/>
-          <w:sz w:val="20"/>
-        </w:rPr>
-        <w:t>Презентации заказчикам; согласование состава метрик и дашбордов.</w:t>
-      </w:r>
-    </w:p>
-    <w:p>
-      <w:pPr>
-        <w:spacing w:before="200" w:after="20"/>
-      </w:pPr>
-      <w:r>
-        <w:rPr>
-          <w:rFonts w:ascii="Arial" w:hAnsi="Arial" w:eastAsia="Arial"/>
-          <w:b/>
-          <w:i w:val="0"/>
-          <w:color w:val="222222"/>
-          <w:sz w:val="20"/>
-        </w:rPr>
-        <w:t>Декабрь 2007 — Декабрь 2009</w:t>
-      </w:r>
-      <w:r>
-        <w:rPr>
-          <w:rFonts w:ascii="Arial" w:hAnsi="Arial" w:eastAsia="Arial"/>
-          <w:b w:val="0"/>
-          <w:i w:val="0"/>
-          <w:color w:val="666666"/>
-          <w:sz w:val="19"/>
-        </w:rPr>
-        <w:t xml:space="preserve">    2 года 1 месяц</w:t>
-      </w:r>
-    </w:p>
-    <w:p>
-      <w:pPr>
-        <w:spacing w:before="0" w:after="20" w:line="252" w:lineRule="auto"/>
-      </w:pPr>
-      <w:r>
-        <w:rPr>
-          <w:rFonts w:ascii="Arial" w:hAnsi="Arial" w:eastAsia="Arial"/>
-          <w:b/>
-          <w:i w:val="0"/>
-          <w:color w:val="222222"/>
-          <w:sz w:val="22"/>
-        </w:rPr>
-        <w:t>ЗАО «Верисел Проекты»</w:t>
-      </w:r>
-    </w:p>
-    <w:p>
-      <w:pPr>
-        <w:spacing w:before="0" w:after="0" w:line="252" w:lineRule="auto"/>
-      </w:pPr>
-      <w:r>
-        <w:rPr>
-          <w:rFonts w:ascii="Arial" w:hAnsi="Arial" w:eastAsia="Arial"/>
-          <w:b w:val="0"/>
-          <w:i w:val="0"/>
-          <w:color w:val="666666"/>
-          <w:sz w:val="19"/>
-        </w:rPr>
-        <w:t>Москва</w:t>
-      </w:r>
-    </w:p>
-    <w:p>
-      <w:pPr>
-        <w:spacing w:before="0" w:after="0" w:line="252" w:lineRule="auto"/>
-      </w:pPr>
-      <w:r>
-        <w:rPr>
-          <w:rFonts w:ascii="Arial" w:hAnsi="Arial" w:eastAsia="Arial"/>
-          <w:b w:val="0"/>
-          <w:i w:val="0"/>
-          <w:color w:val="666666"/>
-          <w:sz w:val="19"/>
-        </w:rPr>
-        <w:t>Информационные технологии, системная интеграция, интернет</w:t>
-      </w:r>
-    </w:p>
-    <w:p>
-      <w:pPr>
-        <w:spacing w:before="0" w:after="0" w:line="252" w:lineRule="auto"/>
-      </w:pPr>
-      <w:r>
-        <w:rPr>
-          <w:rFonts w:ascii="Arial" w:hAnsi="Arial" w:eastAsia="Arial"/>
-          <w:b w:val="0"/>
-          <w:i w:val="0"/>
-          <w:color w:val="666666"/>
-          <w:sz w:val="19"/>
-        </w:rPr>
-        <w:t>• Системная интеграция, автоматизация технологических и бизнес-процессов, ИТ-консалтинг</w:t>
-      </w:r>
-    </w:p>
-    <w:p>
-      <w:pPr>
-        <w:spacing w:before="80" w:after="60" w:line="252" w:lineRule="auto"/>
-      </w:pPr>
-      <w:r>
-        <w:rPr>
-          <w:rFonts w:ascii="Arial" w:hAnsi="Arial" w:eastAsia="Arial"/>
-          <w:b/>
-          <w:i w:val="0"/>
-          <w:color w:val="222222"/>
-          <w:sz w:val="21"/>
-        </w:rPr>
-        <w:t>Менеджер проектов по системам мониторинга</w:t>
-      </w:r>
-    </w:p>
-    <w:p>
-      <w:pPr>
-        <w:spacing w:before="80" w:after="40" w:line="252" w:lineRule="auto"/>
-      </w:pPr>
-      <w:r>
-        <w:rPr>
-          <w:rFonts w:ascii="Arial" w:hAnsi="Arial" w:eastAsia="Arial"/>
-          <w:b/>
-          <w:i w:val="0"/>
-          <w:color w:val="222222"/>
-          <w:sz w:val="20"/>
-        </w:rPr>
-        <w:t>Достижения:</w:t>
-      </w:r>
-    </w:p>
-    <w:p>
-      <w:pPr>
-        <w:pStyle w:val="ListBullet"/>
-        <w:spacing w:before="0" w:after="20" w:line="252" w:lineRule="auto"/>
-      </w:pPr>
-      <w:r>
-        <w:rPr>
-          <w:rFonts w:ascii="Arial" w:hAnsi="Arial" w:eastAsia="Arial"/>
-          <w:b w:val="0"/>
-          <w:i w:val="0"/>
-          <w:color w:val="222222"/>
-          <w:sz w:val="20"/>
-        </w:rPr>
-        <w:t>Тестовое внедрение системы мониторинга в ОАО «ЦентрТелеком» — выбор продукта для мониторинга.</w:t>
-      </w:r>
-    </w:p>
-    <w:p>
-      <w:pPr>
-        <w:pStyle w:val="ListBullet"/>
-        <w:spacing w:before="0" w:after="20" w:line="252" w:lineRule="auto"/>
-      </w:pPr>
-      <w:r>
-        <w:rPr>
-          <w:rFonts w:ascii="Arial" w:hAnsi="Arial" w:eastAsia="Arial"/>
-          <w:b w:val="0"/>
-          <w:i w:val="0"/>
-          <w:color w:val="222222"/>
-          <w:sz w:val="20"/>
-        </w:rPr>
-        <w:t>Подготовка документации и переговоры по системам мониторинга и управления: МТС, ЦентрТелеком.</w:t>
-      </w:r>
-    </w:p>
-    <w:p>
-      <w:pPr>
-        <w:pStyle w:val="ListBullet"/>
-        <w:spacing w:before="0" w:after="20" w:line="252" w:lineRule="auto"/>
-      </w:pPr>
-      <w:r>
-        <w:rPr>
-          <w:rFonts w:ascii="Arial" w:hAnsi="Arial" w:eastAsia="Arial"/>
-          <w:b w:val="0"/>
-          <w:i w:val="0"/>
-          <w:color w:val="222222"/>
-          <w:sz w:val="20"/>
-        </w:rPr>
-        <w:t>Инициация и ведение проекта мониторинга бизнес-приложений в ИНГ Банк (Евразия).</w:t>
-      </w:r>
-    </w:p>
-    <w:p>
-      <w:pPr>
-        <w:spacing w:before="80" w:after="40" w:line="252" w:lineRule="auto"/>
-      </w:pPr>
-      <w:r>
-        <w:rPr>
-          <w:rFonts w:ascii="Arial" w:hAnsi="Arial" w:eastAsia="Arial"/>
-          <w:b/>
-          <w:i w:val="0"/>
-          <w:color w:val="222222"/>
-          <w:sz w:val="20"/>
-        </w:rPr>
-        <w:t>Обязанности:</w:t>
-      </w:r>
-    </w:p>
-    <w:p>
-      <w:pPr>
-        <w:pStyle w:val="ListBullet"/>
-        <w:spacing w:before="0" w:after="20" w:line="252" w:lineRule="auto"/>
-      </w:pPr>
-      <w:r>
-        <w:rPr>
-          <w:rFonts w:ascii="Arial" w:hAnsi="Arial" w:eastAsia="Arial"/>
-          <w:b w:val="0"/>
-          <w:i w:val="0"/>
-          <w:color w:val="222222"/>
-          <w:sz w:val="20"/>
-        </w:rPr>
-        <w:t>Ведение проектов внедрения систем мониторинга.</w:t>
-      </w:r>
-    </w:p>
-    <w:p>
-      <w:pPr>
-        <w:pStyle w:val="ListBullet"/>
-        <w:spacing w:before="0" w:after="20" w:line="252" w:lineRule="auto"/>
-      </w:pPr>
-      <w:r>
-        <w:rPr>
-          <w:rFonts w:ascii="Arial" w:hAnsi="Arial" w:eastAsia="Arial"/>
-          <w:b w:val="0"/>
-          <w:i w:val="0"/>
-          <w:color w:val="222222"/>
-          <w:sz w:val="20"/>
-        </w:rPr>
-        <w:t>Подготовка проектной и тендерной документации.</w:t>
-      </w:r>
-    </w:p>
-    <w:p>
-      <w:pPr>
-        <w:pStyle w:val="ListBullet"/>
-        <w:spacing w:before="0" w:after="20" w:line="252" w:lineRule="auto"/>
-      </w:pPr>
-      <w:r>
-        <w:rPr>
-          <w:rFonts w:ascii="Arial" w:hAnsi="Arial" w:eastAsia="Arial"/>
-          <w:b w:val="0"/>
-          <w:i w:val="0"/>
-          <w:color w:val="222222"/>
-          <w:sz w:val="20"/>
-        </w:rPr>
-        <w:t>Подбор и координация субподрядчиков; подготовка материалов для заказчика.</w:t>
-      </w:r>
-    </w:p>
-    <w:p>
-      <w:pPr>
-        <w:spacing w:before="200" w:after="20"/>
-      </w:pPr>
-      <w:r>
-        <w:rPr>
-          <w:rFonts w:ascii="Arial" w:hAnsi="Arial" w:eastAsia="Arial"/>
-          <w:b/>
-          <w:i w:val="0"/>
-          <w:color w:val="222222"/>
-          <w:sz w:val="20"/>
-        </w:rPr>
-        <w:t>Январь 2007 — Декабрь 2007</w:t>
-      </w:r>
-      <w:r>
-        <w:rPr>
-          <w:rFonts w:ascii="Arial" w:hAnsi="Arial" w:eastAsia="Arial"/>
-          <w:b w:val="0"/>
-          <w:i w:val="0"/>
-          <w:color w:val="666666"/>
-          <w:sz w:val="19"/>
-        </w:rPr>
-        <w:t xml:space="preserve">    1 год</w:t>
-      </w:r>
-    </w:p>
-    <w:p>
-      <w:pPr>
-        <w:spacing w:before="0" w:after="20" w:line="252" w:lineRule="auto"/>
-      </w:pPr>
-      <w:r>
-        <w:rPr>
-          <w:rFonts w:ascii="Arial" w:hAnsi="Arial" w:eastAsia="Arial"/>
-          <w:b/>
-          <w:i w:val="0"/>
-          <w:color w:val="222222"/>
-          <w:sz w:val="22"/>
-        </w:rPr>
-        <w:t>Мобильные ТелеСистемы (МТС)</w:t>
-      </w:r>
-    </w:p>
-    <w:p>
-      <w:pPr>
-        <w:spacing w:before="0" w:after="0" w:line="252" w:lineRule="auto"/>
-      </w:pPr>
-      <w:r>
-        <w:rPr>
-          <w:rFonts w:ascii="Arial" w:hAnsi="Arial" w:eastAsia="Arial"/>
-          <w:b w:val="0"/>
-          <w:i w:val="0"/>
-          <w:color w:val="666666"/>
-          <w:sz w:val="19"/>
-        </w:rPr>
-        <w:t>Россия, www.mts.ru</w:t>
-      </w:r>
-    </w:p>
-    <w:p>
-      <w:pPr>
-        <w:spacing w:before="0" w:after="0" w:line="252" w:lineRule="auto"/>
-      </w:pPr>
-      <w:r>
-        <w:rPr>
-          <w:rFonts w:ascii="Arial" w:hAnsi="Arial" w:eastAsia="Arial"/>
-          <w:b w:val="0"/>
-          <w:i w:val="0"/>
-          <w:color w:val="666666"/>
-          <w:sz w:val="19"/>
-        </w:rPr>
-        <w:t>Телекоммуникации, связь</w:t>
-      </w:r>
-    </w:p>
-    <w:p>
-      <w:pPr>
-        <w:spacing w:before="0" w:after="0" w:line="252" w:lineRule="auto"/>
-      </w:pPr>
-      <w:r>
-        <w:rPr>
-          <w:rFonts w:ascii="Arial" w:hAnsi="Arial" w:eastAsia="Arial"/>
-          <w:b w:val="0"/>
-          <w:i w:val="0"/>
-          <w:color w:val="666666"/>
-          <w:sz w:val="19"/>
-        </w:rPr>
-        <w:t>• Мобильная связь</w:t>
-      </w:r>
-    </w:p>
-    <w:p>
-      <w:pPr>
-        <w:spacing w:before="80" w:after="60" w:line="252" w:lineRule="auto"/>
-      </w:pPr>
-      <w:r>
-        <w:rPr>
-          <w:rFonts w:ascii="Arial" w:hAnsi="Arial" w:eastAsia="Arial"/>
-          <w:b/>
-          <w:i w:val="0"/>
-          <w:color w:val="222222"/>
-          <w:sz w:val="21"/>
-        </w:rPr>
-        <w:t>Руководитель группы развития системы мониторинга Бизнес Единицы «МТС Россия»</w:t>
-      </w:r>
-    </w:p>
-    <w:p>
-      <w:pPr>
-        <w:spacing w:before="80" w:after="40" w:line="252" w:lineRule="auto"/>
-      </w:pPr>
-      <w:r>
-        <w:rPr>
-          <w:rFonts w:ascii="Arial" w:hAnsi="Arial" w:eastAsia="Arial"/>
-          <w:b/>
-          <w:i w:val="0"/>
-          <w:color w:val="222222"/>
-          <w:sz w:val="20"/>
-        </w:rPr>
-        <w:t>Достижения:</w:t>
-      </w:r>
-    </w:p>
-    <w:p>
-      <w:pPr>
-        <w:pStyle w:val="ListBullet"/>
-        <w:spacing w:before="0" w:after="20" w:line="252" w:lineRule="auto"/>
-      </w:pPr>
-      <w:r>
-        <w:rPr>
-          <w:rFonts w:ascii="Arial" w:hAnsi="Arial" w:eastAsia="Arial"/>
-          <w:b w:val="0"/>
-          <w:i w:val="0"/>
-          <w:color w:val="222222"/>
-          <w:sz w:val="20"/>
-        </w:rPr>
-        <w:t>Разработаны документы: Архитектура Единой системы мониторинга; Политика построения системы мониторинга; Регламент управления изменениями; инструкции для пользователей.</w:t>
-      </w:r>
-    </w:p>
-    <w:p>
-      <w:pPr>
-        <w:pStyle w:val="ListBullet"/>
-        <w:spacing w:before="0" w:after="20" w:line="252" w:lineRule="auto"/>
-      </w:pPr>
-      <w:r>
-        <w:rPr>
-          <w:rFonts w:ascii="Arial" w:hAnsi="Arial" w:eastAsia="Arial"/>
-          <w:b w:val="0"/>
-          <w:i w:val="0"/>
-          <w:color w:val="222222"/>
-          <w:sz w:val="20"/>
-        </w:rPr>
-        <w:t>Построена инфраструктура Единой системы мониторинга.</w:t>
-      </w:r>
-    </w:p>
-    <w:p>
-      <w:pPr>
-        <w:pStyle w:val="ListBullet"/>
-        <w:spacing w:before="0" w:after="20" w:line="252" w:lineRule="auto"/>
-      </w:pPr>
-      <w:r>
-        <w:rPr>
-          <w:rFonts w:ascii="Arial" w:hAnsi="Arial" w:eastAsia="Arial"/>
-          <w:b w:val="0"/>
-          <w:i w:val="0"/>
-          <w:color w:val="222222"/>
-          <w:sz w:val="20"/>
-        </w:rPr>
-        <w:t>Внедрён прототип в части сбора данных и визуализации бизнес-KPI.</w:t>
-      </w:r>
-    </w:p>
-    <w:p>
-      <w:pPr>
-        <w:pStyle w:val="ListBullet"/>
-        <w:spacing w:before="0" w:after="20" w:line="252" w:lineRule="auto"/>
-      </w:pPr>
-      <w:r>
-        <w:rPr>
-          <w:rFonts w:ascii="Arial" w:hAnsi="Arial" w:eastAsia="Arial"/>
-          <w:b w:val="0"/>
-          <w:i w:val="0"/>
-          <w:color w:val="222222"/>
-          <w:sz w:val="20"/>
-        </w:rPr>
-        <w:t>Подготовлен пакет документов и успешно защищён бюджет проекта на инвестиционном комитете.</w:t>
-      </w:r>
-    </w:p>
-    <w:p>
-      <w:pPr>
-        <w:pStyle w:val="ListBullet"/>
-        <w:spacing w:before="0" w:after="20" w:line="252" w:lineRule="auto"/>
-      </w:pPr>
-      <w:r>
-        <w:rPr>
-          <w:rFonts w:ascii="Arial" w:hAnsi="Arial" w:eastAsia="Arial"/>
-          <w:b w:val="0"/>
-          <w:i w:val="0"/>
-          <w:color w:val="222222"/>
-          <w:sz w:val="20"/>
-        </w:rPr>
-        <w:t>Организована поддержка пользователей системы мониторинга.</w:t>
-      </w:r>
-    </w:p>
-    <w:p>
-      <w:pPr>
-        <w:spacing w:before="80" w:after="40" w:line="252" w:lineRule="auto"/>
-      </w:pPr>
-      <w:r>
-        <w:rPr>
-          <w:rFonts w:ascii="Arial" w:hAnsi="Arial" w:eastAsia="Arial"/>
-          <w:b/>
-          <w:i w:val="0"/>
-          <w:color w:val="222222"/>
-          <w:sz w:val="20"/>
-        </w:rPr>
-        <w:t>Обязанности:</w:t>
-      </w:r>
-    </w:p>
-    <w:p>
-      <w:pPr>
-        <w:pStyle w:val="ListBullet"/>
-        <w:spacing w:before="0" w:after="20" w:line="252" w:lineRule="auto"/>
-      </w:pPr>
-      <w:r>
-        <w:rPr>
-          <w:rFonts w:ascii="Arial" w:hAnsi="Arial" w:eastAsia="Arial"/>
-          <w:b w:val="0"/>
-          <w:i w:val="0"/>
-          <w:color w:val="222222"/>
-          <w:sz w:val="20"/>
-        </w:rPr>
-        <w:t>Развитие продукта единой системы мониторинга информационных систем: архитектура, метрики, визуализация KPI.</w:t>
-      </w:r>
-    </w:p>
-    <w:p>
-      <w:pPr>
-        <w:pStyle w:val="ListBullet"/>
-        <w:spacing w:before="0" w:after="20" w:line="252" w:lineRule="auto"/>
-      </w:pPr>
-      <w:r>
-        <w:rPr>
-          <w:rFonts w:ascii="Arial" w:hAnsi="Arial" w:eastAsia="Arial"/>
-          <w:b w:val="0"/>
-          <w:i w:val="0"/>
-          <w:color w:val="222222"/>
-          <w:sz w:val="20"/>
-        </w:rPr>
-        <w:t>Описание процессов и регламентирующей документации в объёме, необходимом для мониторинга.</w:t>
-      </w:r>
-    </w:p>
-    <w:p>
-      <w:pPr>
-        <w:pStyle w:val="ListBullet"/>
-        <w:spacing w:before="0" w:after="20" w:line="252" w:lineRule="auto"/>
-      </w:pPr>
-      <w:r>
-        <w:rPr>
-          <w:rFonts w:ascii="Arial" w:hAnsi="Arial" w:eastAsia="Arial"/>
-          <w:b w:val="0"/>
-          <w:i w:val="0"/>
-          <w:color w:val="222222"/>
-          <w:sz w:val="20"/>
-        </w:rPr>
-        <w:t>Постановка задач команде интеграторов; обучение и консультации пользователей.</w:t>
-      </w:r>
-    </w:p>
-    <w:p>
-      <w:pPr>
-        <w:pStyle w:val="ListBullet"/>
-        <w:spacing w:before="0" w:after="20" w:line="252" w:lineRule="auto"/>
-      </w:pPr>
-      <w:r>
-        <w:rPr>
-          <w:rFonts w:ascii="Arial" w:hAnsi="Arial" w:eastAsia="Arial"/>
-          <w:b w:val="0"/>
-          <w:i w:val="0"/>
-          <w:color w:val="222222"/>
-          <w:sz w:val="20"/>
-        </w:rPr>
-        <w:t>Участие во внедрении процессов ITSM; подготовка материалов для инвестиционных решений.</w:t>
+        <w:t>• Постановка задач интеграторам; поддержка пользователей.</w:t>
       </w:r>
     </w:p>
     <w:p>
@@ -3093,11 +2578,6 @@
           <w:sz w:val="21"/>
         </w:rPr>
         <w:t>Коммуникабельный, ответственный, самостоятельный. Быстро обучаюсь, постоянно повышаю профессиональный уровень. Умение работать с людьми и доводить продукт до видимого результата для пользователей.</w:t>
-      </w:r>
-    </w:p>
-    <w:p>
-      <w:r>
-        <w:br w:type="page"/>
       </w:r>
     </w:p>
     <w:p>

</xml_diff>

<commit_message>
Job title: Product Manager PO, remove Analyst specialization
</commit_message>
<xml_diff>
--- a/Abramov_DN_resume_PO_monitoring.docx
+++ b/Abramov_DN_resume_PO_monitoring.docx
@@ -133,11 +133,10 @@
         <w:rPr>
           <w:rFonts w:ascii="Arial" w:hAnsi="Arial" w:eastAsia="Arial"/>
           <w:b/>
-          <w:i w:val="0"/>
           <w:color w:val="222222"/>
           <w:sz w:val="24"/>
         </w:rPr>
-        <w:t>Владелец продукта (Product Owner) мониторинга процессов данных / BI</w:t>
+        <w:t>Менеджер продукта (PO) мониторинга процессов данных / BI</w:t>
       </w:r>
     </w:p>
     <w:p>
@@ -163,26 +162,10 @@
         <w:rPr>
           <w:rFonts w:ascii="Arial" w:hAnsi="Arial" w:eastAsia="Arial"/>
           <w:b w:val="0"/>
-          <w:i w:val="0"/>
           <w:color w:val="222222"/>
           <w:sz w:val="20"/>
         </w:rPr>
-        <w:t>—  Менеджер продукта</w:t>
-      </w:r>
-    </w:p>
-    <w:p>
-      <w:pPr>
-        <w:spacing w:before="0" w:after="80" w:line="252" w:lineRule="auto"/>
-      </w:pPr>
-      <w:r>
-        <w:rPr>
-          <w:rFonts w:ascii="Arial" w:hAnsi="Arial" w:eastAsia="Arial"/>
-          <w:b w:val="0"/>
-          <w:i w:val="0"/>
-          <w:color w:val="222222"/>
-          <w:sz w:val="20"/>
-        </w:rPr>
-        <w:t>—  Аналитик</w:t>
+        <w:t>—  Менеджер продукта / Product Owner</w:t>
       </w:r>
     </w:p>
     <w:p>
@@ -2635,12 +2618,9 @@
       <w:r>
         <w:rPr>
           <w:rFonts w:ascii="Arial" w:hAnsi="Arial" w:eastAsia="Arial"/>
-          <w:b w:val="0"/>
-          <w:i w:val="0"/>
-          <w:color w:val="222222"/>
           <w:sz w:val="21"/>
         </w:rPr>
-        <w:t>Целевая роль — Product Owner продукта мониторинга процессов данных / BI: разобрать процесс → согласовать метрики и подход → дашборд на экране → обратная связь и развитие следующего инкремента. Описание процесса (в т.ч. BPMN) — часть продуктовой проработки для метрик и мониторинга.</w:t>
+        <w:t>Целевая роль — менеджер продукта (PO) мониторинга процессов данных / BI: разобрать процесс → согласовать метрики и подход → дашборд на экране → обратная связь и развитие следующего инкремента. Описание процесса (в т.ч. BPMN) — часть продуктовой проработки для метрик и мониторинга.</w:t>
       </w:r>
     </w:p>
     <w:p>
@@ -2650,12 +2630,9 @@
       <w:r>
         <w:rPr>
           <w:rFonts w:ascii="Arial" w:hAnsi="Arial" w:eastAsia="Arial"/>
-          <w:b w:val="0"/>
-          <w:i w:val="0"/>
-          <w:color w:val="222222"/>
           <w:sz w:val="21"/>
         </w:rPr>
-        <w:t>Моя зона ответственности как владельца продукта: видение мониторинга, приоритизация, работа с пользователями, постановка задач команде внедрения и приёмка результата.</w:t>
+        <w:t>Моя зона ответственности как менеджера продукта (PO): видение мониторинга, приоритизация, работа с пользователями, постановка задач команде внедрения и приёмка результата.</w:t>
       </w:r>
     </w:p>
     <w:p>

</xml_diff>

<commit_message>
Remove greenfield wording and cover letter from resume docx
</commit_message>
<xml_diff>
--- a/Abramov_DN_resume_PO_monitoring.docx
+++ b/Abramov_DN_resume_PO_monitoring.docx
@@ -342,7 +342,7 @@
           <w:color w:val="222222"/>
           <w:sz w:val="21"/>
         </w:rPr>
-        <w:t>Технический руководитель проекта (greenfield DWH)</w:t>
+        <w:t>Технический руководитель проекта DWH</w:t>
       </w:r>
     </w:p>
     <w:p>
@@ -372,7 +372,7 @@
           <w:color w:val="222222"/>
           <w:sz w:val="20"/>
         </w:rPr>
-        <w:t>После опыта построения систем управленческой отчётности и BI (Axenix) — расширение компетенции на уровень платформы данных. Создание greenfield DWH на open-source стеке: архитектура, инфраструктура, контуры загрузки, витрины; затем подключение BI. Выстроен CI/CD для поставки изменений по контурам хранилища.</w:t>
+        <w:t>После опыта построения систем управленческой отчётности и BI (Axenix) — расширение компетенции на уровень платформы данных. Создание DWH на open-source стеке: архитектура, инфраструктура, контуры загрузки, витрины; затем подключение BI. Выстроен CI/CD для поставки изменений по контурам хранилища.</w:t>
       </w:r>
     </w:p>
     <w:p>
@@ -2545,7 +2545,7 @@
           <w:color w:val="222222"/>
           <w:sz w:val="21"/>
         </w:rPr>
-        <w:t>Развиваюсь как владелец продукта в зоне BI и мониторинга процессов данных: потребность → метрики и подход → дашборд → обратная связь и следующий инкремент. В Axenix — системы управленческой отчётности и BI; в ПСБ — расширение компетенции на платформу данных: greenfield DWH, контуры загрузки, архитектура, ИБ, CI/CD, команда, ресурсы, закупки. Опыт CSI и End-to-End мониторинга процессов в SberData; системы мониторинга в телекоме.</w:t>
+        <w:t>Развиваюсь как владелец продукта в зоне BI и мониторинга процессов данных: потребность → метрики и подход → дашборд → обратная связь и следующий инкремент. В Axenix — системы управленческой отчётности и BI; в ПСБ — расширение компетенции на платформу данных: DWH, контуры загрузки, архитектура, ИБ, CI/CD, команда, ресурсы, закупки. Опыт CSI и End-to-End мониторинга процессов в SberData; системы мониторинга в телекоме.</w:t>
       </w:r>
     </w:p>
     <w:p>
@@ -2561,138 +2561,6 @@
           <w:sz w:val="21"/>
         </w:rPr>
         <w:t>Коммуникабельный, ответственный, самостоятельный. Быстро обучаюсь, постоянно повышаю профессиональный уровень. Умение работать с людьми и доводить продукт до видимого результата для пользователей.</w:t>
-      </w:r>
-    </w:p>
-    <w:p>
-      <w:pPr>
-        <w:spacing w:before="240" w:after="120"/>
-        <w:pBdr>
-          <w:bottom w:val="single" w:sz="12" w:space="4" w:color="CCCCCC"/>
-        </w:pBdr>
-      </w:pPr>
-      <w:r>
-        <w:rPr>
-          <w:rFonts w:ascii="Arial" w:hAnsi="Arial" w:eastAsia="Arial"/>
-          <w:b/>
-          <w:i w:val="0"/>
-          <w:color w:val="222222"/>
-          <w:sz w:val="26"/>
-        </w:rPr>
-        <w:t>Сопроводительное письмо</w:t>
-      </w:r>
-    </w:p>
-    <w:p>
-      <w:pPr>
-        <w:spacing w:before="0" w:after="160" w:line="252" w:lineRule="auto"/>
-      </w:pPr>
-      <w:r>
-        <w:rPr>
-          <w:rFonts w:ascii="Arial" w:hAnsi="Arial" w:eastAsia="Arial"/>
-          <w:b/>
-          <w:i w:val="0"/>
-          <w:color w:val="222222"/>
-          <w:sz w:val="22"/>
-        </w:rPr>
-        <w:t>Ларисе Ихсановой</w:t>
-      </w:r>
-    </w:p>
-    <w:p>
-      <w:pPr>
-        <w:spacing w:before="0" w:after="120" w:line="252" w:lineRule="auto"/>
-      </w:pPr>
-      <w:r>
-        <w:rPr>
-          <w:rFonts w:ascii="Arial" w:hAnsi="Arial" w:eastAsia="Arial"/>
-          <w:b w:val="0"/>
-          <w:i w:val="0"/>
-          <w:color w:val="222222"/>
-          <w:sz w:val="21"/>
-        </w:rPr>
-        <w:t>Лариса, спасибо за разговор. Прикладываю резюме.</w:t>
-      </w:r>
-    </w:p>
-    <w:p>
-      <w:pPr>
-        <w:spacing w:before="0" w:after="120" w:line="252" w:lineRule="auto"/>
-      </w:pPr>
-      <w:r>
-        <w:rPr>
-          <w:rFonts w:ascii="Arial" w:hAnsi="Arial" w:eastAsia="Arial"/>
-          <w:sz w:val="21"/>
-        </w:rPr>
-        <w:t>Целевая роль — менеджер продукта (PO) мониторинга процессов данных / BI: разобрать процесс → согласовать метрики и подход → дашборд на экране → обратная связь и развитие следующего инкремента. Описание процесса (в т.ч. BPMN) — часть продуктовой проработки для метрик и мониторинга.</w:t>
-      </w:r>
-    </w:p>
-    <w:p>
-      <w:pPr>
-        <w:spacing w:before="0" w:after="120" w:line="252" w:lineRule="auto"/>
-      </w:pPr>
-      <w:r>
-        <w:rPr>
-          <w:rFonts w:ascii="Arial" w:hAnsi="Arial" w:eastAsia="Arial"/>
-          <w:sz w:val="21"/>
-        </w:rPr>
-        <w:t>Моя зона ответственности как менеджера продукта (PO): видение мониторинга, приоритизация, работа с пользователями, постановка задач команде внедрения и приёмка результата.</w:t>
-      </w:r>
-    </w:p>
-    <w:p>
-      <w:pPr>
-        <w:spacing w:before="0" w:after="200" w:line="252" w:lineRule="auto"/>
-      </w:pPr>
-      <w:r>
-        <w:rPr>
-          <w:rFonts w:ascii="Arial" w:hAnsi="Arial" w:eastAsia="Arial"/>
-          <w:b w:val="0"/>
-          <w:i w:val="0"/>
-          <w:color w:val="222222"/>
-          <w:sz w:val="21"/>
-        </w:rPr>
-        <w:t>Буду рад обсудить, есть ли такой контур у вас или у коллег по платформе и BI.</w:t>
-      </w:r>
-    </w:p>
-    <w:p>
-      <w:pPr>
-        <w:spacing w:before="0" w:after="40" w:line="252" w:lineRule="auto"/>
-      </w:pPr>
-      <w:r>
-        <w:rPr>
-          <w:rFonts w:ascii="Arial" w:hAnsi="Arial" w:eastAsia="Arial"/>
-          <w:b w:val="0"/>
-          <w:i w:val="0"/>
-          <w:color w:val="222222"/>
-          <w:sz w:val="21"/>
-        </w:rPr>
-        <w:t>С уважением,</w:t>
-      </w:r>
-    </w:p>
-    <w:p>
-      <w:pPr>
-        <w:spacing w:before="0" w:after="40" w:line="252" w:lineRule="auto"/>
-      </w:pPr>
-      <w:r>
-        <w:rPr>
-          <w:rFonts w:ascii="Arial" w:hAnsi="Arial" w:eastAsia="Arial"/>
-          <w:b/>
-          <w:i w:val="0"/>
-          <w:color w:val="222222"/>
-          <w:sz w:val="21"/>
-        </w:rPr>
-        <w:t>Дмитрий Абрамов</w:t>
-      </w:r>
-    </w:p>
-    <w:p>
-      <w:pPr>
-        <w:spacing w:before="0" w:after="60" w:line="252" w:lineRule="auto"/>
-      </w:pPr>
-      <w:r>
-        <w:rPr>
-          <w:rFonts w:ascii="Arial" w:hAnsi="Arial" w:eastAsia="Arial"/>
-          <w:b w:val="0"/>
-          <w:i w:val="0"/>
-          <w:color w:val="222222"/>
-          <w:sz w:val="21"/>
-        </w:rPr>
-        <w:t>+7 (903) 155-89-49  ·  abramov-dn@yandex.ru</w:t>
       </w:r>
     </w:p>
     <w:sectPr>

</xml_diff>